<commit_message>
Show V1 / V2 / Effect changes in report, deck and notebook
Section 0 of the report, deck slide 3 and the notebook header now use the
same V1 / V2 / Effect table as the README.

Co-Authored-By: Claude Opus 5.5 <noreply@anthropic.com>
</commit_message>
<xml_diff>
--- a/V2_methodology_explainer.docx
+++ b/V2_methodology_explainer.docx
@@ -462,7 +462,7 @@
           <w:b w:val="0"/>
           <w:i w:val="0"/>
         </w:rPr>
-        <w:t>The trainer's last comment was: be able to explain every choice and rebuild the backtest yourself. This document is built for that. Section 2 is the project in one page. Section 3 walks through every design choice: what was done, why, what the alternative was, and how to check it. Section 4 rebuilds the backtest step by step - follow it with src/minimal_backtest.py open. Section 5 lists questions an interviewer is likely to ask, with short answers. Section 6 lists the numbers worth knowing by heart.</w:t>
+        <w:t>The goal is to be able to explain every choice and rebuild the backtest yourself. This document is built for that. Section 2 is the project in one page. Section 3 walks through every design choice: what was done, why, what the alternative was, and how to check it. Section 4 rebuilds the backtest step by step - follow it with src/minimal_backtest.py open. Section 5 lists questions an interviewer is likely to ask, with short answers. Section 6 lists the numbers worth knowing by heart.</w:t>
       </w:r>
     </w:p>
     <w:p>
@@ -1928,7 +1928,7 @@
           <w:b/>
           <w:i w:val="0"/>
         </w:rPr>
-        <w:t>How did the trainer's feedback change your results?</w:t>
+        <w:t>How did version 2 change your results?</w:t>
       </w:r>
     </w:p>
     <w:p>

</xml_diff>